<commit_message>
08_개인논문_ACT적재: v2 n100 결과 (90/88/72%, 연속 62%), ACT 적재 장면 v2
Co-Authored-By: Claude Opus 5.5 <noreply@anthropic.com>
</commit_message>
<xml_diff>
--- a/08_개인논문_ACT적재/논문/paper.docx
+++ b/08_개인논문_ACT적재/논문/paper.docx
@@ -392,7 +392,7 @@
           <w:sz w:val="18"/>
           <w:szCs w:val="18"/>
         </w:rPr>
-        <w:t xml:space="preserve">This paper presents an edge-AI smart-factory cell that sorts products by weight and stacks them with a low-cost robot arm. On a Jetson Orin Nano, a YOLOv8n model (validation mAP50 86.3%) reads the 7-segment display of a digital scale; separating capture and inference threads raised the capture rate from 1.2 to 59.5 FPS, two-stage digital-zoom inference raised mid-range accuracy from 45% to 90%, and the cell sorted 91.7% of items correctly with an 810 ms response. When a bin reaches 118 g, a Model Context Protocol (MCP) trigger runs stage-specific ACT (Action Chunking with Transformers) policies on an SO-101 arm that stack the bin on the first floor, beside the first bin and on top of it. Because the arm was damaged after the field tests, the cell was rebuilt in MuJoCo with the same robot model, cameras and 30 Hz control to evaluate the stacking quantitatively. Per-stage success hides error accumulation: with the initial 100 demonstrations per stage the placements succeeded in 76%, 84% and 50% of trials but only 28% of three-stage sequences. Most failures were grasps in which the fixed jaw landed on the bin wall; demonstrations that approach the wall with a 9 mm clearance widened the tolerated grasp error from 3 mm to 11 mm and raised the sequence success to [  ]% with 100, [  ]% with 1000 demonstrations and [  ]% with DART noise injection.</w:t>
+        <w:t xml:space="preserve">This paper presents an edge-AI smart-factory cell that sorts products by weight and stacks them with a low-cost robot arm. On a Jetson Orin Nano, a YOLOv8n model (validation mAP50 86.3%) reads the 7-segment display of a digital scale; separating capture and inference threads raised the capture rate from 1.2 to 59.5 FPS, two-stage digital-zoom inference raised mid-range accuracy from 45% to 90%, and the cell sorted 91.7% of items correctly with an 810 ms response. When a bin reaches 118 g, a Model Context Protocol (MCP) trigger runs stage-specific ACT (Action Chunking with Transformers) policies on an SO-101 arm that stack the bin on the first floor, beside the first bin and on top of it. Because the arm was damaged after the field tests, the cell was rebuilt in MuJoCo with the same robot model, cameras and 30 Hz control to evaluate the stacking quantitatively. Per-stage success hides error accumulation: with the initial 100 demonstrations per stage the placements succeeded in 76%, 84% and 50% of trials but only 28% of three-stage sequences. Most failures were grasps in which the fixed jaw landed on the bin wall; demonstrations that approach the wall with a 9 mm clearance widened the tolerated grasp error from 3 mm to 11 mm and raised the sequence success to 62% with 100, [  ]% with 1000 demonstrations and [  ]% with DART noise injection.</w:t>
       </w:r>
     </w:p>
     <w:p>
@@ -1112,7 +1112,7 @@
           <w:sz w:val="18"/>
           <w:szCs w:val="18"/>
         </w:rPr>
-        <w:t xml:space="preserve">원격조작 대신 역기구학 기반 스크립트 전문가로 시연을 만들었으며, ACT 원 논문도 시뮬레이션 과제에서 스크립트 시연을 사용하였고[4], 시연을 자동으로 만들어 데이터 양을 늘리는 방법도 연구되고 있다[15]. 전문가는 로봇 쪽 통 벽을 고정 집게는 바깥, 움직이는 집게는 안쪽에 두고 집어 옮기며, 경유점 사이를 최소 저크 궤적으로 잇고 구간 속도(±10%)와 경유점 위치(최대 ±6mm)를 흔들어 사람 시연의 변동을 흉내 냈다. 특히 고정 집게를 벽 바깥 9mm에 두고 내려가도록 하여, 집게가 벽을 사이에 둘 수 있는 범위(바깥 0~17mm)의 가운데로 접근하게 하였다. 초기 설계(여유 1.5mm)는 안쪽으로 3mm만 어긋나도 집게가 벽 위에 걸렸으나, 이 설계는 ±9mm의 위치 오차에서도 파지에 성공하였다(표 1, 전문가 시험 각 4~6회). 시연은 270스텝(9초)이며 성공한 것만 남겼다(전문가 성공률 1층 [  ]%, 옆 [  ]%, 2층 [  ]%).</w:t>
+        <w:t xml:space="preserve">원격조작 대신 역기구학 기반 스크립트 전문가로 시연을 만들었으며, ACT 원 논문도 시뮬레이션 과제에서 스크립트 시연을 사용하였고[4], 시연을 자동으로 만들어 데이터 양을 늘리는 방법도 연구되고 있다[15]. 전문가는 로봇 쪽 통 벽을 고정 집게는 바깥, 움직이는 집게는 안쪽에 두고 집어 옮기며, 경유점 사이를 최소 저크 궤적으로 잇고 구간 속도(±10%)와 경유점 위치(최대 ±6mm)를 흔들어 사람 시연의 변동을 흉내 냈다. 특히 고정 집게를 벽 바깥 9mm에 두고 내려가도록 하여, 집게가 벽을 사이에 둘 수 있는 범위(바깥 0~17mm)의 가운데로 접근하게 하였다. 초기 설계(여유 1.5mm)는 안쪽으로 3mm만 어긋나도 집게가 벽 위에 걸렸으나, 이 설계는 ±9mm의 위치 오차에서도 파지에 성공하였다(표 1, 전문가 시험 각 4~6회). 시연은 270스텝(9초)이며 성공한 것만 남겼다(전문가 성공률 1층 100%, 옆 96%, 2층 99%).</w:t>
       </w:r>
     </w:p>
     <w:p>
@@ -3658,7 +3658,7 @@
                 <w:sz w:val="15"/>
                 <w:szCs w:val="15"/>
               </w:rPr>
-              <w:t xml:space="preserve">[  ]</w:t>
+              <w:t xml:space="preserve">90</w:t>
             </w:r>
           </w:p>
         </w:tc>
@@ -3679,7 +3679,7 @@
                 <w:sz w:val="15"/>
                 <w:szCs w:val="15"/>
               </w:rPr>
-              <w:t xml:space="preserve">[  ]</w:t>
+              <w:t xml:space="preserve">88</w:t>
             </w:r>
           </w:p>
         </w:tc>
@@ -3700,7 +3700,7 @@
                 <w:sz w:val="15"/>
                 <w:szCs w:val="15"/>
               </w:rPr>
-              <w:t xml:space="preserve">[  ]</w:t>
+              <w:t xml:space="preserve">72</w:t>
             </w:r>
           </w:p>
         </w:tc>
@@ -3721,7 +3721,7 @@
                 <w:sz w:val="15"/>
                 <w:szCs w:val="15"/>
               </w:rPr>
-              <w:t xml:space="preserve">[  ]</w:t>
+              <w:t xml:space="preserve">62</w:t>
             </w:r>
           </w:p>
         </w:tc>
@@ -4478,7 +4478,7 @@
           <w:sz w:val="18"/>
           <w:szCs w:val="18"/>
         </w:rPr>
-        <w:t xml:space="preserve">표 6은 단계별 성공률(각 50회)과 세 단계를 이어 수행한 연속 성공률(50회)이다. 초기 시연(여유 1.5mm, 100회)의 단계별 성공률은 1층 76%, 옆 84%, 2층 50%였으나, 앞 단계의 배치 오차가 다음 단계로 넘어가 연속 성공률은 28%에 그쳤다. 실패의 대부분은 고정 집게가 통 벽 위에 걸려 끝까지 내려가지 못한 채 닫힌 경우였고, 정책은 평균 5mm가량 벽 쪽으로 치우쳤다. 파지 여유를 9mm로 둔 시연으로 같은 100회를 학습하면 단계별 [  ]%, [  ]%, [  ]%, 연속 [  ]%로 바뀌었다.</w:t>
+        <w:t xml:space="preserve">표 6은 단계별 성공률(각 50회)과 세 단계를 이어 수행한 연속 성공률(50회)이다. 초기 시연(여유 1.5mm, 100회)의 단계별 성공률은 1층 76%, 옆 84%, 2층 50%였으나, 앞 단계의 배치 오차가 다음 단계로 넘어가 연속 성공률은 28%에 그쳤다. 실패의 대부분은 고정 집게가 통 벽 위에 걸려 끝까지 내려가지 못한 채 닫힌 경우였고, 정책은 평균 5mm가량 벽 쪽으로 치우쳤다. 파지 여유를 9mm로 둔 시연으로 같은 100회를 학습하면 단계별 90%, 88%, 72%, 연속 62%로 바뀌었다.</w:t>
       </w:r>
     </w:p>
     <w:p>

</xml_diff>

<commit_message>
08_개인논문_ACT적재: v5 n100 200회 평가 연속 99.0% (95% CI 96.4–99.7), 목표 95% 통계적으로 확인
Co-Authored-By: Claude Opus 5.5 <noreply@anthropic.com>
</commit_message>
<xml_diff>
--- a/08_개인논문_ACT적재/논문/paper.docx
+++ b/08_개인논문_ACT적재/논문/paper.docx
@@ -670,7 +670,206 @@
           <w:sz w:val="18"/>
           <w:szCs w:val="18"/>
         </w:rPr>
-        <w:t xml:space="preserve">인식부는 네 가지로 구성하였다. 캡처 스레드는 최신 프레임만 공유 버퍼에 쓰고 추론 스레드가 5초 주기로 이를 가져와 추론하여, 단일 루프에서 추론이 캡처를 막던 문제를 없앴다. ONNX Runtime[11] 세션에는 연산 스레드 6개, 병렬 실행, 전체 그래프 최적화를 적용하여 단일 스레드 대비 약 3배 빠르게 하였다. 거리가 멀어 숫자가 작아지면 '8'을 '1'로 읽었으므로, 1단계에서 표시부(screen) 영역을 찾고 여백 15화소와 함께 잘라 640×640으로 확대한 뒤 숫자를 다시 탐지하는 2단계 디지털 줌을 썼다. 한 숫자에 여러 상자가 겹쳐 '118'이 '111111888'로 조합되는 문제는 ① 비숫자 클래스 제거, ② IoU 0.4 NMS, ③ 자릿수 구역별 최고 신뢰도 선택, ④ 반복 숫자 복원의 4단계로 해결하였다(그림 2).</w:t>
+        <w:t xml:space="preserve">인식부는 네 가지로 구성하였다. 캡처 스레드는 최신 프레임만 공유 버퍼에 쓰고 추론 스레드가 5초 주기로 이를 가져와 추론하여, 단일 루프에서 추론이 캡처를 막던 문제를 없앴다. ONNX Runtime[11] 세션에는 연산 스레드 6개, 병렬 실행, 전체 그래프 최적화를 적용하여 단일 스레드 대비 약 3배 빠르게 하였다. 거리가 멀어 숫자가 작아지면 '8'을 '1'로 읽었으므로, 1단계에서 표시부(screen) 영역을 찾고 여백 15화소와 함께 잘라 640×640으로 확대한 뒤 숫자를 다시 탐지하는 2단계 디지털 줌을 썼다. 한 숫자에 여러 상자가 겹쳐 '118'이 '111111888'로 조합되는 문제는 ① 비숫자 클래스 제거, ② IoU 0.4 NMS, ③ 자릿수 구역별 최고 신뢰도 선택, ④ 반복 숫자 복원의 4단계로 해결하였다.</w:t>
+      </w:r>
+    </w:p>
+    <w:p>
+      <w:pPr>
+        <w:pStyle w:val="a3"/>
+        <w:keepNext/>
+        <w:wordWrap/>
+        <w:spacing w:before="60" w:after="0" w:line="288" w:lineRule="auto"/>
+        <w:jc w:val="left"/>
+      </w:pPr>
+      <w:r>
+        <w:rPr>
+          <w:rFonts w:ascii="HY신명조" w:eastAsia="HY신명조" w:hAnsi="HY신명조" w:hint="eastAsia"/>
+          <w:sz w:val="20"/>
+          <w:szCs w:val="20"/>
+        </w:rPr>
+        <w:t xml:space="preserve">2.3 ACT 기반 순차 적재</w:t>
+      </w:r>
+    </w:p>
+    <w:p>
+      <w:pPr>
+        <w:pStyle w:val="a3"/>
+        <w:wordWrap/>
+        <w:spacing w:before="0" w:after="0" w:line="288" w:lineRule="auto"/>
+        <w:ind w:firstLine="180"/>
+        <w:jc w:val="both"/>
+      </w:pPr>
+      <w:r>
+        <w:rPr>
+          <w:rFonts w:ascii="HY신명조" w:eastAsia="HY신명조" w:hAnsi="HY신명조" w:hint="eastAsia"/>
+          <w:sz w:val="18"/>
+          <w:szCs w:val="18"/>
+        </w:rPr>
+        <w:t xml:space="preserve">로봇은 그리퍼를 포함해 6개 관절을 갖는 SO-101 팔로워암이며, 손목 카메라(front)와 상단 카메라(top)를 쓴다. 시연은 사람이 리더암을 움직이면 팔로워암이 따라 움직이는 원격조작으로, 30Hz로 영상과 관절값을 기록해 단계마다 100회와 200회의 두 차례 수집하였다.</w:t>
+      </w:r>
+    </w:p>
+    <w:p>
+      <w:pPr>
+        <w:pStyle w:val="a3"/>
+        <w:wordWrap/>
+        <w:spacing w:before="0" w:after="0" w:line="288" w:lineRule="auto"/>
+        <w:ind w:firstLine="180"/>
+        <w:jc w:val="both"/>
+      </w:pPr>
+      <w:r>
+        <w:rPr>
+          <w:rFonts w:ascii="HY신명조" w:eastAsia="HY신명조" w:hAnsi="HY신명조" w:hint="eastAsia"/>
+          <w:sz w:val="18"/>
+          <w:szCs w:val="18"/>
+        </w:rPr>
+        <w:t xml:space="preserve">ACT는 현재 영상과 관절값으로부터 앞으로 k=100스텝의 관절 목표값(행동 청크)을 한 번에 예측한다. ResNet18[12] 영상 특징과 관절값을 Transformer[13] 인코더-디코더로 처리하고, 시연의 다양성은 CVAE 잠재변수로 흡수하며, 손실은 L1 재구성 오차와 KL 항(가중치 10)의 합이다[4]. 별도의 객체 검출 없이 영상에서 통의 위치를 스스로 익힌다. LeRobot의 ACT는 작업 지시문을 입력으로 쓰지 않으므로 1층·옆·2층 단계마다 정책 π</w:t>
+      </w:r>
+      <w:r>
+        <w:rPr>
+          <w:rFonts w:ascii="HY신명조" w:eastAsia="HY신명조" w:hAnsi="HY신명조" w:hint="eastAsia"/>
+          <w:vertAlign w:val="subscript"/>
+          <w:sz w:val="18"/>
+        </w:rPr>
+        <w:t xml:space="preserve">1</w:t>
+      </w:r>
+      <w:r>
+        <w:rPr>
+          <w:rFonts w:ascii="HY신명조" w:eastAsia="HY신명조" w:hAnsi="HY신명조" w:hint="eastAsia"/>
+          <w:sz w:val="18"/>
+          <w:szCs w:val="18"/>
+        </w:rPr>
+        <w:t xml:space="preserve">, π</w:t>
+      </w:r>
+      <w:r>
+        <w:rPr>
+          <w:rFonts w:ascii="HY신명조" w:eastAsia="HY신명조" w:hAnsi="HY신명조" w:hint="eastAsia"/>
+          <w:vertAlign w:val="subscript"/>
+          <w:sz w:val="18"/>
+        </w:rPr>
+        <w:t xml:space="preserve">2</w:t>
+      </w:r>
+      <w:r>
+        <w:rPr>
+          <w:rFonts w:ascii="HY신명조" w:eastAsia="HY신명조" w:hAnsi="HY신명조" w:hint="eastAsia"/>
+          <w:sz w:val="18"/>
+          <w:szCs w:val="18"/>
+        </w:rPr>
+        <w:t xml:space="preserve">, π</w:t>
+      </w:r>
+      <w:r>
+        <w:rPr>
+          <w:rFonts w:ascii="HY신명조" w:eastAsia="HY신명조" w:hAnsi="HY신명조" w:hint="eastAsia"/>
+          <w:vertAlign w:val="subscript"/>
+          <w:sz w:val="18"/>
+        </w:rPr>
+        <w:t xml:space="preserve">3</w:t>
+      </w:r>
+      <w:r>
+        <w:rPr>
+          <w:rFonts w:ascii="HY신명조" w:eastAsia="HY신명조" w:hAnsi="HY신명조" w:hint="eastAsia"/>
+          <w:sz w:val="18"/>
+          <w:szCs w:val="18"/>
+        </w:rPr>
+        <w:t xml:space="preserve">을 따로 학습하였다. 학습은 PC(NVIDIA L4, RTX 3060)에서 하고 체크포인트만 Jetson Orin Nano로 옮겨 실행하였다.</w:t>
+      </w:r>
+    </w:p>
+    <w:p>
+      <w:pPr>
+        <w:pStyle w:val="a3"/>
+        <w:wordWrap/>
+        <w:spacing w:before="0" w:after="0" w:line="288" w:lineRule="auto"/>
+        <w:ind w:firstLine="180"/>
+        <w:jc w:val="both"/>
+      </w:pPr>
+      <w:r>
+        <w:rPr>
+          <w:rFonts w:ascii="HY신명조" w:eastAsia="HY신명조" w:hAnsi="HY신명조" w:hint="eastAsia"/>
+          <w:sz w:val="18"/>
+          <w:szCs w:val="18"/>
+        </w:rPr>
+        <w:t xml:space="preserve">실행기는 MCP TCP 서버(포트 8765)에서 run 신호를 기다리다(WAIT) 해당 단계의 정책을 실행하고(RUNNING), 시작 자세로 돌아온 뒤(RETURN_HOME) 다음 신호를 기다린다. 실행 중에 들어온 신호는 무시하고, 세 단계를 마치면 DONE 상태에서 reset 신호를 기다린다. Jetson에서는 스레드 수 제한, CUDA 지연 로딩, 자동 혼합 정밀도를 적용하였다.</w:t>
+      </w:r>
+    </w:p>
+    <w:p>
+      <w:pPr>
+        <w:pStyle w:val="a3"/>
+        <w:wordWrap/>
+        <w:spacing w:before="0" w:after="0" w:line="288" w:lineRule="auto"/>
+        <w:jc w:val="left"/>
+      </w:pPr>
+      <w:r>
+        <w:rPr>
+          <w:rFonts w:ascii="HY신명조" w:eastAsia="HY신명조" w:hAnsi="HY신명조" w:hint="eastAsia"/>
+          <w:sz w:val="18"/>
+          <w:szCs w:val="18"/>
+        </w:rPr>
+        <w:t xml:space="preserve"/>
+      </w:r>
+    </w:p>
+    <w:p>
+      <w:pPr>
+        <w:pStyle w:val="a3"/>
+        <w:keepNext/>
+        <w:wordWrap/>
+        <w:spacing w:before="0" w:after="0" w:line="288" w:lineRule="auto"/>
+        <w:jc w:val="center"/>
+      </w:pPr>
+      <w:r>
+        <w:rPr>
+          <w:rFonts w:ascii="HY신명조" w:eastAsia="HY신명조" w:hAnsi="HY신명조" w:hint="eastAsia"/>
+          <w:sz w:val="24"/>
+          <w:szCs w:val="24"/>
+        </w:rPr>
+        <w:t xml:space="preserve">Ⅲ. 시뮬레이션 기반 적재 평가</w:t>
+      </w:r>
+    </w:p>
+    <w:p>
+      <w:pPr>
+        <w:pStyle w:val="a3"/>
+        <w:wordWrap/>
+        <w:spacing w:before="0" w:after="0" w:line="288" w:lineRule="auto"/>
+        <w:jc w:val="left"/>
+      </w:pPr>
+      <w:r>
+        <w:rPr>
+          <w:rFonts w:ascii="HY신명조" w:eastAsia="HY신명조" w:hAnsi="HY신명조" w:hint="eastAsia"/>
+          <w:sz w:val="18"/>
+          <w:szCs w:val="18"/>
+        </w:rPr>
+        <w:t xml:space="preserve"/>
+      </w:r>
+    </w:p>
+    <w:p>
+      <w:pPr>
+        <w:pStyle w:val="a3"/>
+        <w:keepNext/>
+        <w:wordWrap/>
+        <w:spacing w:before="60" w:after="0" w:line="288" w:lineRule="auto"/>
+        <w:jc w:val="left"/>
+      </w:pPr>
+      <w:r>
+        <w:rPr>
+          <w:rFonts w:ascii="HY신명조" w:eastAsia="HY신명조" w:hAnsi="HY신명조" w:hint="eastAsia"/>
+          <w:sz w:val="20"/>
+          <w:szCs w:val="20"/>
+        </w:rPr>
+        <w:t xml:space="preserve">3.1 시뮬레이션 셀</w:t>
+      </w:r>
+    </w:p>
+    <w:p>
+      <w:pPr>
+        <w:pStyle w:val="a3"/>
+        <w:wordWrap/>
+        <w:spacing w:before="0" w:after="0" w:line="288" w:lineRule="auto"/>
+        <w:ind w:firstLine="180"/>
+        <w:jc w:val="both"/>
+      </w:pPr>
+      <w:r>
+        <w:rPr>
+          <w:rFonts w:ascii="HY신명조" w:eastAsia="HY신명조" w:hAnsi="HY신명조" w:hint="eastAsia"/>
+          <w:sz w:val="18"/>
+          <w:szCs w:val="18"/>
+        </w:rPr>
+        <w:t xml:space="preserve">현장 시험 이후 로봇팔이 파손되어 적재 결과를 다시 측정할 수 없었다. 이에 MuJoCo[8]로 실제 셀을 재현하였다(그림 2). 로봇은 공식 SO-101 모델[14]의 손목 카메라 버전으로 STS3215 서보의 위치 제어 특성을 포함하며, 카메라 배치, 제어 주기(30Hz), 관절 목표값 행동 공간을 실제와 같게 하였다. 영상은 실제 경량 추론 설정과 같은 160×120을 쓴다. 분류 통은 공개 모델의 출력 무게(통 33g)와 시연 영상으로부터 64×64×52mm(벽 2mm)로 정하고 내부 큐브를 포함해 123g으로 두었다. 저울 위 통은 위치 ±20mm, 방향 ±20°, 먼저 쌓인 통은 목표에서 ±8mm, ±5°로 무작위화하였다.</w:t>
       </w:r>
     </w:p>
     <w:p xmlns:a="http://schemas.openxmlformats.org/drawingml/2006/main" xmlns:pic="http://schemas.openxmlformats.org/drawingml/2006/picture">
@@ -687,7 +886,7 @@
         </w:rPr>
         <w:drawing>
           <wp:inline distT="0" distB="0" distL="0" distR="0">
-            <wp:extent cx="2793333" cy="1792736"/>
+            <wp:extent cx="2793333" cy="1385123"/>
             <wp:docPr id="102" name="Figure 2"/>
             <a:graphic>
               <a:graphicData uri="http://schemas.openxmlformats.org/drawingml/2006/picture">
@@ -698,266 +897,6 @@
                   </pic:nvPicPr>
                   <pic:blipFill>
                     <a:blip r:embed="rIdFig2"/>
-                    <a:stretch>
-                      <a:fillRect/>
-                    </a:stretch>
-                  </pic:blipFill>
-                  <pic:spPr>
-                    <a:xfrm>
-                      <a:off x="0" y="0"/>
-                      <a:ext cx="2793333" cy="1792736"/>
-                    </a:xfrm>
-                    <a:prstGeom prst="rect">
-                      <a:avLst/>
-                    </a:prstGeom>
-                  </pic:spPr>
-                </pic:pic>
-              </a:graphicData>
-            </a:graphic>
-          </wp:inline>
-        </w:drawing>
-      </w:r>
-    </w:p>
-    <w:p>
-      <w:pPr>
-        <w:pStyle w:val="a3"/>
-        <w:wordWrap/>
-        <w:spacing w:before="0" w:after="80" w:line="264" w:lineRule="auto"/>
-        <w:jc w:val="center"/>
-      </w:pPr>
-      <w:r>
-        <w:rPr>
-          <w:rFonts w:ascii="HY신명조" w:eastAsia="HY신명조" w:hAnsi="HY신명조" w:hint="eastAsia"/>
-          <w:sz w:val="17"/>
-          <w:szCs w:val="17"/>
-        </w:rPr>
-        <w:t xml:space="preserve">그림 2. 7-segment 무게 인식 파이프라인</w:t>
-      </w:r>
-    </w:p>
-    <w:p>
-      <w:pPr>
-        <w:pStyle w:val="a3"/>
-        <w:keepNext/>
-        <w:wordWrap/>
-        <w:spacing w:before="60" w:after="0" w:line="288" w:lineRule="auto"/>
-        <w:jc w:val="left"/>
-      </w:pPr>
-      <w:r>
-        <w:rPr>
-          <w:rFonts w:ascii="HY신명조" w:eastAsia="HY신명조" w:hAnsi="HY신명조" w:hint="eastAsia"/>
-          <w:sz w:val="20"/>
-          <w:szCs w:val="20"/>
-        </w:rPr>
-        <w:t xml:space="preserve">2.3 ACT 기반 순차 적재</w:t>
-      </w:r>
-    </w:p>
-    <w:p>
-      <w:pPr>
-        <w:pStyle w:val="a3"/>
-        <w:wordWrap/>
-        <w:spacing w:before="0" w:after="0" w:line="288" w:lineRule="auto"/>
-        <w:ind w:firstLine="180"/>
-        <w:jc w:val="both"/>
-      </w:pPr>
-      <w:r>
-        <w:rPr>
-          <w:rFonts w:ascii="HY신명조" w:eastAsia="HY신명조" w:hAnsi="HY신명조" w:hint="eastAsia"/>
-          <w:sz w:val="18"/>
-          <w:szCs w:val="18"/>
-        </w:rPr>
-        <w:t xml:space="preserve">로봇은 그리퍼를 포함해 6개 관절을 갖는 SO-101 팔로워암이며, 손목 카메라(front)와 상단 카메라(top)를 쓴다. 시연은 사람이 리더암을 움직이면 팔로워암이 따라 움직이는 원격조작으로, 30Hz로 영상과 관절값을 기록해 단계마다 100회와 200회의 두 차례 수집하였다.</w:t>
-      </w:r>
-    </w:p>
-    <w:p>
-      <w:pPr>
-        <w:pStyle w:val="a3"/>
-        <w:wordWrap/>
-        <w:spacing w:before="0" w:after="0" w:line="288" w:lineRule="auto"/>
-        <w:ind w:firstLine="180"/>
-        <w:jc w:val="both"/>
-      </w:pPr>
-      <w:r>
-        <w:rPr>
-          <w:rFonts w:ascii="HY신명조" w:eastAsia="HY신명조" w:hAnsi="HY신명조" w:hint="eastAsia"/>
-          <w:sz w:val="18"/>
-          <w:szCs w:val="18"/>
-        </w:rPr>
-        <w:t xml:space="preserve">ACT는 현재 영상과 관절값으로부터 앞으로 k=100스텝의 관절 목표값(행동 청크)을 한 번에 예측한다. ResNet18[12] 영상 특징과 관절값을 Transformer[13] 인코더-디코더로 처리하고, 시연의 다양성은 CVAE 잠재변수로 흡수하며, 손실은 L1 재구성 오차와 KL 항(가중치 10)의 합이다[4]. 별도의 객체 검출 없이 영상에서 통의 위치를 스스로 익힌다. LeRobot의 ACT는 작업 지시문을 입력으로 쓰지 않으므로 1층·옆·2층 단계마다 정책 π</w:t>
-      </w:r>
-      <w:r>
-        <w:rPr>
-          <w:rFonts w:ascii="HY신명조" w:eastAsia="HY신명조" w:hAnsi="HY신명조" w:hint="eastAsia"/>
-          <w:vertAlign w:val="subscript"/>
-          <w:sz w:val="18"/>
-        </w:rPr>
-        <w:t xml:space="preserve">1</w:t>
-      </w:r>
-      <w:r>
-        <w:rPr>
-          <w:rFonts w:ascii="HY신명조" w:eastAsia="HY신명조" w:hAnsi="HY신명조" w:hint="eastAsia"/>
-          <w:sz w:val="18"/>
-          <w:szCs w:val="18"/>
-        </w:rPr>
-        <w:t xml:space="preserve">, π</w:t>
-      </w:r>
-      <w:r>
-        <w:rPr>
-          <w:rFonts w:ascii="HY신명조" w:eastAsia="HY신명조" w:hAnsi="HY신명조" w:hint="eastAsia"/>
-          <w:vertAlign w:val="subscript"/>
-          <w:sz w:val="18"/>
-        </w:rPr>
-        <w:t xml:space="preserve">2</w:t>
-      </w:r>
-      <w:r>
-        <w:rPr>
-          <w:rFonts w:ascii="HY신명조" w:eastAsia="HY신명조" w:hAnsi="HY신명조" w:hint="eastAsia"/>
-          <w:sz w:val="18"/>
-          <w:szCs w:val="18"/>
-        </w:rPr>
-        <w:t xml:space="preserve">, π</w:t>
-      </w:r>
-      <w:r>
-        <w:rPr>
-          <w:rFonts w:ascii="HY신명조" w:eastAsia="HY신명조" w:hAnsi="HY신명조" w:hint="eastAsia"/>
-          <w:vertAlign w:val="subscript"/>
-          <w:sz w:val="18"/>
-        </w:rPr>
-        <w:t xml:space="preserve">3</w:t>
-      </w:r>
-      <w:r>
-        <w:rPr>
-          <w:rFonts w:ascii="HY신명조" w:eastAsia="HY신명조" w:hAnsi="HY신명조" w:hint="eastAsia"/>
-          <w:sz w:val="18"/>
-          <w:szCs w:val="18"/>
-        </w:rPr>
-        <w:t xml:space="preserve">을 따로 학습하였다. 학습은 PC(NVIDIA L4, RTX 3060)에서 하고 체크포인트만 Jetson Orin Nano로 옮겨 실행하였다.</w:t>
-      </w:r>
-    </w:p>
-    <w:p>
-      <w:pPr>
-        <w:pStyle w:val="a3"/>
-        <w:wordWrap/>
-        <w:spacing w:before="0" w:after="0" w:line="288" w:lineRule="auto"/>
-        <w:ind w:firstLine="180"/>
-        <w:jc w:val="both"/>
-      </w:pPr>
-      <w:r>
-        <w:rPr>
-          <w:rFonts w:ascii="HY신명조" w:eastAsia="HY신명조" w:hAnsi="HY신명조" w:hint="eastAsia"/>
-          <w:sz w:val="18"/>
-          <w:szCs w:val="18"/>
-        </w:rPr>
-        <w:t xml:space="preserve">실행기는 MCP TCP 서버(포트 8765)에서 run 신호를 기다리다(WAIT) 해당 단계의 정책을 실행하고(RUNNING), 시작 자세로 돌아온 뒤(RETURN_HOME) 다음 신호를 기다린다. 실행 중에 들어온 신호는 무시하고, 세 단계를 마치면 DONE 상태에서 reset 신호를 기다린다. Jetson에서는 스레드 수 제한, CUDA 지연 로딩, 자동 혼합 정밀도를 적용하였다.</w:t>
-      </w:r>
-    </w:p>
-    <w:p>
-      <w:pPr>
-        <w:pStyle w:val="a3"/>
-        <w:wordWrap/>
-        <w:spacing w:before="0" w:after="0" w:line="288" w:lineRule="auto"/>
-        <w:jc w:val="left"/>
-      </w:pPr>
-      <w:r>
-        <w:rPr>
-          <w:rFonts w:ascii="HY신명조" w:eastAsia="HY신명조" w:hAnsi="HY신명조" w:hint="eastAsia"/>
-          <w:sz w:val="18"/>
-          <w:szCs w:val="18"/>
-        </w:rPr>
-        <w:t xml:space="preserve"/>
-      </w:r>
-    </w:p>
-    <w:p>
-      <w:pPr>
-        <w:pStyle w:val="a3"/>
-        <w:keepNext/>
-        <w:wordWrap/>
-        <w:spacing w:before="0" w:after="0" w:line="288" w:lineRule="auto"/>
-        <w:jc w:val="center"/>
-      </w:pPr>
-      <w:r>
-        <w:rPr>
-          <w:rFonts w:ascii="HY신명조" w:eastAsia="HY신명조" w:hAnsi="HY신명조" w:hint="eastAsia"/>
-          <w:sz w:val="24"/>
-          <w:szCs w:val="24"/>
-        </w:rPr>
-        <w:t xml:space="preserve">Ⅲ. 시뮬레이션 기반 적재 평가</w:t>
-      </w:r>
-    </w:p>
-    <w:p>
-      <w:pPr>
-        <w:pStyle w:val="a3"/>
-        <w:wordWrap/>
-        <w:spacing w:before="0" w:after="0" w:line="288" w:lineRule="auto"/>
-        <w:jc w:val="left"/>
-      </w:pPr>
-      <w:r>
-        <w:rPr>
-          <w:rFonts w:ascii="HY신명조" w:eastAsia="HY신명조" w:hAnsi="HY신명조" w:hint="eastAsia"/>
-          <w:sz w:val="18"/>
-          <w:szCs w:val="18"/>
-        </w:rPr>
-        <w:t xml:space="preserve"/>
-      </w:r>
-    </w:p>
-    <w:p>
-      <w:pPr>
-        <w:pStyle w:val="a3"/>
-        <w:keepNext/>
-        <w:wordWrap/>
-        <w:spacing w:before="60" w:after="0" w:line="288" w:lineRule="auto"/>
-        <w:jc w:val="left"/>
-      </w:pPr>
-      <w:r>
-        <w:rPr>
-          <w:rFonts w:ascii="HY신명조" w:eastAsia="HY신명조" w:hAnsi="HY신명조" w:hint="eastAsia"/>
-          <w:sz w:val="20"/>
-          <w:szCs w:val="20"/>
-        </w:rPr>
-        <w:t xml:space="preserve">3.1 시뮬레이션 셀</w:t>
-      </w:r>
-    </w:p>
-    <w:p>
-      <w:pPr>
-        <w:pStyle w:val="a3"/>
-        <w:wordWrap/>
-        <w:spacing w:before="0" w:after="0" w:line="288" w:lineRule="auto"/>
-        <w:ind w:firstLine="180"/>
-        <w:jc w:val="both"/>
-      </w:pPr>
-      <w:r>
-        <w:rPr>
-          <w:rFonts w:ascii="HY신명조" w:eastAsia="HY신명조" w:hAnsi="HY신명조" w:hint="eastAsia"/>
-          <w:sz w:val="18"/>
-          <w:szCs w:val="18"/>
-        </w:rPr>
-        <w:t xml:space="preserve">현장 시험 이후 로봇팔이 파손되어 적재 결과를 다시 측정할 수 없었다. 이에 MuJoCo[8]로 실제 셀을 재현하였다(그림 3). 로봇은 공식 SO-101 모델[14]의 손목 카메라 버전으로 STS3215 서보의 위치 제어 특성을 포함하며, 카메라 배치, 제어 주기(30Hz), 관절 목표값 행동 공간을 실제와 같게 하였다. 영상은 실제 경량 추론 설정과 같은 160×120을 쓴다. 분류 통은 공개 모델의 출력 무게(통 33g)와 시연 영상으로부터 64×64×52mm(벽 2mm)로 정하고 내부 큐브를 포함해 123g으로 두었다. 저울 위 통은 위치 ±20mm, 방향 ±20°, 먼저 쌓인 통은 목표에서 ±8mm, ±5°로 무작위화하였다.</w:t>
-      </w:r>
-    </w:p>
-    <w:p xmlns:a="http://schemas.openxmlformats.org/drawingml/2006/main" xmlns:pic="http://schemas.openxmlformats.org/drawingml/2006/picture">
-      <w:pPr>
-        <w:pStyle w:val="a3"/>
-        <w:keepNext/>
-        <w:wordWrap/>
-        <w:spacing w:before="80" w:after="0" w:line="240" w:lineRule="auto"/>
-        <w:jc w:val="center"/>
-      </w:pPr>
-      <w:r>
-        <w:rPr>
-          <w:noProof/>
-        </w:rPr>
-        <w:drawing>
-          <wp:inline distT="0" distB="0" distL="0" distR="0">
-            <wp:extent cx="2793333" cy="1385123"/>
-            <wp:docPr id="103" name="Figure 3"/>
-            <a:graphic>
-              <a:graphicData uri="http://schemas.openxmlformats.org/drawingml/2006/picture">
-                <pic:pic>
-                  <pic:nvPicPr>
-                    <pic:cNvPr id="103" name="fig3.png"/>
-                    <pic:cNvPicPr/>
-                  </pic:nvPicPr>
-                  <pic:blipFill>
-                    <a:blip r:embed="rIdFig3"/>
                     <a:stretch>
                       <a:fillRect/>
                     </a:stretch>
@@ -991,7 +930,7 @@
           <w:sz w:val="17"/>
           <w:szCs w:val="17"/>
         </w:rPr>
-        <w:t xml:space="preserve">그림 3. 시뮬레이션 셀 (a) 전체 (b) 손목 카메라 (c) 상단 카메라</w:t>
+        <w:t xml:space="preserve">그림 2. 시뮬레이션 셀 (a) 전체 (b) 손목 카메라 (c) 상단 카메라</w:t>
       </w:r>
     </w:p>
     <w:p>
@@ -2358,7 +2297,7 @@
                 <w:sz w:val="15"/>
                 <w:szCs w:val="15"/>
               </w:rPr>
-              <w:t xml:space="preserve">시연 설계 / 수</w:t>
+              <w:t xml:space="preserve">시연 설계 (시연 수)</w:t>
             </w:r>
           </w:p>
         </w:tc>
@@ -2476,7 +2415,7 @@
                 <w:sz w:val="15"/>
                 <w:szCs w:val="15"/>
               </w:rPr>
-              <w:t xml:space="preserve">① 여유 1.5mm, 로봇 쪽 벽 / 100</w:t>
+              <w:t xml:space="preserve">① 초기 설계 (100)</w:t>
             </w:r>
           </w:p>
         </w:tc>
@@ -2586,7 +2525,7 @@
                 <w:sz w:val="15"/>
                 <w:szCs w:val="15"/>
               </w:rPr>
-              <w:t xml:space="preserve">② 여유 9mm, 로봇 쪽 벽 / 100</w:t>
+              <w:t xml:space="preserve">② +여유 9mm (100)</w:t>
             </w:r>
           </w:p>
         </w:tc>
@@ -2696,7 +2635,7 @@
                 <w:sz w:val="15"/>
                 <w:szCs w:val="15"/>
               </w:rPr>
-              <w:t xml:space="preserve">② / 200</w:t>
+              <w:t xml:space="preserve">② (200)</w:t>
             </w:r>
           </w:p>
         </w:tc>
@@ -2806,7 +2745,7 @@
                 <w:sz w:val="15"/>
                 <w:szCs w:val="15"/>
               </w:rPr>
-              <w:t xml:space="preserve">③ ②+같은 벽 / 100</w:t>
+              <w:t xml:space="preserve">③ +같은 벽 (100)</w:t>
             </w:r>
           </w:p>
         </w:tc>
@@ -2916,7 +2855,7 @@
                 <w:sz w:val="15"/>
                 <w:szCs w:val="15"/>
               </w:rPr>
-              <w:t xml:space="preserve">④ ③+놓은 뒤 물러나기 / 100</w:t>
+              <w:t xml:space="preserve">④ +물러나기 (100)</w:t>
             </w:r>
           </w:p>
         </w:tc>
@@ -3026,7 +2965,7 @@
                 <w:sz w:val="15"/>
                 <w:szCs w:val="15"/>
               </w:rPr>
-              <w:t xml:space="preserve">④ / 200</w:t>
+              <w:t xml:space="preserve">④ (200)</w:t>
             </w:r>
           </w:p>
         </w:tc>
@@ -3136,7 +3075,7 @@
                 <w:sz w:val="15"/>
                 <w:szCs w:val="15"/>
               </w:rPr>
-              <w:t xml:space="preserve">④ / 500</w:t>
+              <w:t xml:space="preserve">④ (500)</w:t>
             </w:r>
           </w:p>
         </w:tc>
@@ -3246,7 +3185,7 @@
                 <w:sz w:val="15"/>
                 <w:szCs w:val="15"/>
               </w:rPr>
-              <w:t xml:space="preserve">④ / 1000</w:t>
+              <w:t xml:space="preserve">④ (1000)</w:t>
             </w:r>
           </w:p>
         </w:tc>
@@ -3356,7 +3295,7 @@
                 <w:sz w:val="15"/>
                 <w:szCs w:val="15"/>
               </w:rPr>
-              <w:t xml:space="preserve">④+DART / 1000</w:t>
+              <w:t xml:space="preserve">④+DART (1000)</w:t>
             </w:r>
           </w:p>
         </w:tc>
@@ -3466,7 +3405,7 @@
                 <w:sz w:val="15"/>
                 <w:szCs w:val="15"/>
               </w:rPr>
-              <w:t xml:space="preserve">④+무작위화·CLAHE / 1000</w:t>
+              <w:t xml:space="preserve">④+무작위화·CLAHE (1000)</w:t>
             </w:r>
           </w:p>
         </w:tc>
@@ -3587,16 +3526,16 @@
         <w:drawing>
           <wp:inline distT="0" distB="0" distL="0" distR="0">
             <wp:extent cx="2793333" cy="1481312"/>
-            <wp:docPr id="104" name="Figure 4"/>
+            <wp:docPr id="103" name="Figure 3"/>
             <a:graphic>
               <a:graphicData uri="http://schemas.openxmlformats.org/drawingml/2006/picture">
                 <pic:pic>
                   <pic:nvPicPr>
-                    <pic:cNvPr id="104" name="fig4.png"/>
+                    <pic:cNvPr id="103" name="fig3.png"/>
                     <pic:cNvPicPr/>
                   </pic:nvPicPr>
                   <pic:blipFill>
-                    <a:blip r:embed="rIdFig4"/>
+                    <a:blip r:embed="rIdFig3"/>
                     <a:stretch>
                       <a:fillRect/>
                     </a:stretch>
@@ -3630,7 +3569,7 @@
           <w:sz w:val="17"/>
           <w:szCs w:val="17"/>
         </w:rPr>
-        <w:t xml:space="preserve">그림 4. 저울 위 통의 회전각과 단계별 결과 (여유 9mm, 로봇 쪽 벽, 시연 100)</w:t>
+        <w:t xml:space="preserve">그림 3. 저울 위 통의 회전각과 단계별 결과 (여유 9mm, 로봇 쪽 벽, 시연 100)</w:t>
       </w:r>
     </w:p>
     <w:p>
@@ -3647,7 +3586,7 @@
           <w:sz w:val="18"/>
           <w:szCs w:val="18"/>
         </w:rPr>
-        <w:t xml:space="preserve">표 3은 단계별 성공률(각 50회)과 세 단계를 이어 수행한 연속 성공률(50회)이다. 초기 시연(여유 1.5mm, 100회)의 단계별 성공률은 1층 76%, 옆 84%, 2층 50%였으나, 앞 단계의 배치 오차가 다음 단계로 넘어가 연속 성공률은 28%에 그쳤다. 실패의 대부분은 고정 집게가 통 벽 위에 걸려 끝까지 내려가지 못한 채 닫힌 경우였다. 파지 여유를 9mm로 둔 시연으로 같은 100회를 학습하면 단계별 90%, 88%, 72%, 연속 62%로 높아졌다. 남은 실패 25건 중 24건은 저울 위 통이 +7.5° 넘게 돌아간 시행에서 일어났다(그림 4). 이 구간의 실패율은 49%, 나머지는 1%로, 전문가가 잡는 벽을 바꾸는 구간과 일치한다. 이때 정책은 앞벽과 옆벽 시연의 중간인 모서리 쪽으로 가서 집게를 벽 위에 얹은 채 닫았다. 같은 설계로 시연을 200회로 늘리면 연속 성공률은 오히려 36%로 낮아졌고, 이 구간의 실패가 24건에서 32건으로 늘었다. 늘 같은 벽을 잡는 시연(③)으로 바꾸자 같은 100회에서 집기 실패가 없어져 단계별 100%, 100%, 86%, 연속 82%가 되었다. 남은 2층 실패는 모두 통 C를 평평하게 놓은 뒤 그리퍼가 곧장 올라가며 고정 집게로 벽을 끌어 올려 10° 넘게 기운 경우였고, 2mm 벽 위에 얹힌 통이라 바닥에서와 달리 다시 내려앉지 못했다. 그리퍼를 벌린 뒤 벽 바깥으로 5mm 물러났다가 올라가는 시연(④, 2층만)으로 바꾸자 전문가의 3° 이상 기울어짐이 50회 중 11회에서 1회로 줄었고, 정책은 단계별 100%, 100%, 100%, 연속 96%였다.</w:t>
+        <w:t xml:space="preserve">표 3은 단계별 성공률(각 50회)과 세 단계를 이어 수행한 연속 성공률(50회)이다. 초기 시연(여유 1.5mm, 100회)의 단계별 성공률은 1층 76%, 옆 84%, 2층 50%였으나, 앞 단계의 배치 오차가 다음 단계로 넘어가 연속 성공률은 28%에 그쳤다. 실패의 대부분은 고정 집게가 통 벽 위에 걸려 끝까지 내려가지 못한 채 닫힌 경우였다. 파지 여유를 9mm로 둔 시연으로 같은 100회를 학습하면 단계별 90%, 88%, 72%, 연속 62%로 높아졌다. 남은 실패 25건 중 24건은 저울 위 통이 +7.5° 넘게 돌아간 시행에서 일어났다(그림 3). 이 구간의 실패율은 49%, 나머지는 1%로, 전문가가 잡는 벽을 바꾸는 구간과 일치한다. 이때 정책은 앞벽과 옆벽 시연의 중간인 모서리 쪽으로 가서 집게를 벽 위에 얹은 채 닫았다. 같은 설계로 시연을 200회로 늘리면 연속 성공률은 오히려 36%로 낮아졌고, 이 구간의 실패가 24건에서 32건으로 늘었다. 늘 같은 벽을 잡는 시연(③)으로 바꾸자 같은 100회에서 집기 실패가 없어져 단계별 100%, 100%, 86%, 연속 82%가 되었다. 남은 2층 실패는 모두 통 C를 평평하게 놓은 뒤 그리퍼가 곧장 올라가며 고정 집게로 벽을 끌어 올려 10° 넘게 기운 경우였고, 2mm 벽 위에 얹힌 통이라 바닥에서와 달리 다시 내려앉지 못했다. 그리퍼를 벌린 뒤 벽 바깥으로 5mm 물러났다가 올라가는 시연(④, 2층만)으로 바꾸자 전문가의 3° 이상 기울어짐이 50회 중 11회에서 1회로 줄었고, 정책은 단계별 100%, 100%, 100%, 연속 96%였다. 같은 정책을 장면 200개로 늘려 평가하면(CPU 추론) 단계별 100.0%, 100.0%, 99.5%, 연속 99.0%(95% CI 96.4–99.7%)로, 팀의 원래 조건인 단계별 시연 100회만으로 연속 성공률 95% 이상을 신뢰구간 하한까지 확인하였다.</w:t>
       </w:r>
     </w:p>
     <w:p>
@@ -3664,7 +3603,7 @@
           <w:sz w:val="18"/>
           <w:szCs w:val="18"/>
         </w:rPr>
-        <w:t xml:space="preserve">④ 시연을 200, 500, 1000회로 늘리면 연속 성공률은 [  ]%, [  ]%, [  ]%였다(그림 5). 시연 잡음을 주입한 DART 정책은 같은 1000회에서 연속 [  ]%였다. 저울을 다시 읽어 통이 그대로 있으면 집기 실패로 보고 같은 단계를 다시 실행하게 하면(최대 3회), ② 시연 100회 정책의 연속 성공률은 58%에서 74%로, ④ 시연 1000회 정책은 [  ]%에서 [  ]%로 높아졌다. 적재 1회는 정책 실행 9초와 홈 복귀 1초로 약 10초가 걸리며, 무게 분류 정분류율(91.7%)을 곱한 공정 전체 성공률은 ④ 시연 1000회 기준 약 [  ]%이다. 모방학습 성능이 시연 수보다 시연의 다양성과 일관성에 좌우된다는 보고[16]와 같이, 시연 수를 늘리는 것만으로는 시연 설계의 효과를 대신하기 어렵다.</w:t>
+        <w:t xml:space="preserve">④ 시연을 200, 500, 1000회로 늘리면 연속 성공률은 [  ]%, [  ]%, [  ]%였다(그림 4). 시연 잡음을 주입한 DART 정책은 같은 1000회에서 연속 [  ]%였다. 저울을 다시 읽어 통이 그대로 있으면 집기 실패로 보고 같은 단계를 다시 실행하게 하면(최대 3회), ② 시연 100회 정책의 연속 성공률은 58%에서 74%로, ④ 시연 1000회 정책은 [  ]%에서 [  ]%로 높아졌다. 적재 1회는 정책 실행 9초와 홈 복귀 1초로 약 10초가 걸리며, 무게 분류 정분류율(91.7%)을 곱한 공정 전체 성공률은 ④ 시연 1000회 기준 약 [  ]%이다. 모방학습 성능이 시연 수보다 시연의 다양성과 일관성에 좌우된다는 보고[16]와 같이, 시연 수를 늘리는 것만으로는 시연 설계의 효과를 대신하기 어렵다.</w:t>
       </w:r>
     </w:p>
     <w:p xmlns:a="http://schemas.openxmlformats.org/drawingml/2006/main" xmlns:pic="http://schemas.openxmlformats.org/drawingml/2006/picture">
@@ -3682,16 +3621,16 @@
         <w:drawing>
           <wp:inline distT="0" distB="0" distL="0" distR="0">
             <wp:extent cx="2793333" cy="1396666"/>
-            <wp:docPr id="105" name="Figure 5"/>
+            <wp:docPr id="104" name="Figure 4"/>
             <a:graphic>
               <a:graphicData uri="http://schemas.openxmlformats.org/drawingml/2006/picture">
                 <pic:pic>
                   <pic:nvPicPr>
-                    <pic:cNvPr id="105" name="fig5.png"/>
+                    <pic:cNvPr id="104" name="fig4.png"/>
                     <pic:cNvPicPr/>
                   </pic:nvPicPr>
                   <pic:blipFill>
-                    <a:blip r:embed="rIdFig5"/>
+                    <a:blip r:embed="rIdFig4"/>
                     <a:stretch>
                       <a:fillRect/>
                     </a:stretch>
@@ -3725,7 +3664,7 @@
           <w:sz w:val="17"/>
           <w:szCs w:val="17"/>
         </w:rPr>
-        <w:t xml:space="preserve">그림 5. ACT 정책의 연속 적재 장면</w:t>
+        <w:t xml:space="preserve">그림 4. ACT 정책의 연속 적재 장면</w:t>
       </w:r>
     </w:p>
     <w:p>

</xml_diff>

<commit_message>
08_개인논문_ACT적재: 최종 모델 + 저울 재시도 연속 200/200 = 100% (95% CI 98.1–100)
Co-Authored-By: Claude Opus 5.5 <noreply@anthropic.com>
</commit_message>
<xml_diff>
--- a/08_개인논문_ACT적재/논문/paper.docx
+++ b/08_개인논문_ACT적재/논문/paper.docx
@@ -2986,7 +2986,7 @@
                 <w:sz w:val="15"/>
                 <w:szCs w:val="15"/>
               </w:rPr>
-              <w:t xml:space="preserve">[  ]</w:t>
+              <w:t xml:space="preserve">100</w:t>
             </w:r>
           </w:p>
         </w:tc>
@@ -3007,7 +3007,7 @@
                 <w:sz w:val="15"/>
                 <w:szCs w:val="15"/>
               </w:rPr>
-              <w:t xml:space="preserve">[  ]</w:t>
+              <w:t xml:space="preserve">98</w:t>
             </w:r>
           </w:p>
         </w:tc>
@@ -3028,7 +3028,7 @@
                 <w:sz w:val="15"/>
                 <w:szCs w:val="15"/>
               </w:rPr>
-              <w:t xml:space="preserve">[  ]</w:t>
+              <w:t xml:space="preserve">100</w:t>
             </w:r>
           </w:p>
         </w:tc>
@@ -3049,7 +3049,7 @@
                 <w:sz w:val="15"/>
                 <w:szCs w:val="15"/>
               </w:rPr>
-              <w:t xml:space="preserve">[  ]</w:t>
+              <w:t xml:space="preserve">92 (81–97)</w:t>
             </w:r>
           </w:p>
         </w:tc>
@@ -3586,24 +3586,7 @@
           <w:sz w:val="18"/>
           <w:szCs w:val="18"/>
         </w:rPr>
-        <w:t xml:space="preserve">표 3은 단계별 성공률(각 50회)과 세 단계를 이어 수행한 연속 성공률(50회)이다. 초기 시연(여유 1.5mm, 100회)의 단계별 성공률은 1층 76%, 옆 84%, 2층 50%였으나, 앞 단계의 배치 오차가 다음 단계로 넘어가 연속 성공률은 28%에 그쳤다. 실패의 대부분은 고정 집게가 통 벽 위에 걸려 끝까지 내려가지 못한 채 닫힌 경우였다. 파지 여유를 9mm로 둔 시연으로 같은 100회를 학습하면 단계별 90%, 88%, 72%, 연속 62%로 높아졌다. 남은 실패 25건 중 24건은 저울 위 통이 +7.5° 넘게 돌아간 시행에서 일어났다(그림 3). 이 구간의 실패율은 49%, 나머지는 1%로, 전문가가 잡는 벽을 바꾸는 구간과 일치한다. 이때 정책은 앞벽과 옆벽 시연의 중간인 모서리 쪽으로 가서 집게를 벽 위에 얹은 채 닫았다. 같은 설계로 시연을 200회로 늘리면 연속 성공률은 오히려 36%로 낮아졌고, 이 구간의 실패가 24건에서 32건으로 늘었다. 늘 같은 벽을 잡는 시연(③)으로 바꾸자 같은 100회에서 집기 실패가 없어져 단계별 100%, 100%, 86%, 연속 82%가 되었다. 남은 2층 실패는 모두 통 C를 평평하게 놓은 뒤 그리퍼가 곧장 올라가며 고정 집게로 벽을 끌어 올려 10° 넘게 기운 경우였고, 2mm 벽 위에 얹힌 통이라 바닥에서와 달리 다시 내려앉지 못했다. 그리퍼를 벌린 뒤 벽 바깥으로 5mm 물러났다가 올라가는 시연(④, 2층만)으로 바꾸자 전문가의 3° 이상 기울어짐이 50회 중 11회에서 1회로 줄었고, 정책은 단계별 100%, 100%, 100%, 연속 96%였다. 같은 정책을 장면 200개로 늘려 평가하면(CPU 추론) 단계별 100.0%, 100.0%, 99.5%, 연속 99.0%(95% CI 96.4–99.7%)로, 팀의 원래 조건인 단계별 시연 100회만으로 연속 성공률 95% 이상을 신뢰구간 하한까지 확인하였다.</w:t>
-      </w:r>
-    </w:p>
-    <w:p>
-      <w:pPr>
-        <w:pStyle w:val="a3"/>
-        <w:wordWrap/>
-        <w:spacing w:before="0" w:after="0" w:line="288" w:lineRule="auto"/>
-        <w:ind w:firstLine="180"/>
-        <w:jc w:val="both"/>
-      </w:pPr>
-      <w:r>
-        <w:rPr>
-          <w:rFonts w:ascii="HY신명조" w:eastAsia="HY신명조" w:hAnsi="HY신명조" w:hint="eastAsia"/>
-          <w:sz w:val="18"/>
-          <w:szCs w:val="18"/>
-        </w:rPr>
-        <w:t xml:space="preserve">④ 시연을 200, 500, 1000회로 늘리면 연속 성공률은 [  ]%, [  ]%, [  ]%였다(그림 4). 시연 잡음을 주입한 DART 정책은 같은 1000회에서 연속 [  ]%였다. 저울을 다시 읽어 통이 그대로 있으면 집기 실패로 보고 같은 단계를 다시 실행하게 하면(최대 3회), ② 시연 100회 정책의 연속 성공률은 58%에서 74%로, ④ 시연 1000회 정책은 [  ]%에서 [  ]%로 높아졌다. 적재 1회는 정책 실행 9초와 홈 복귀 1초로 약 10초가 걸리며, 무게 분류 정분류율(91.7%)을 곱한 공정 전체 성공률은 ④ 시연 1000회 기준 약 [  ]%이다. 모방학습 성능이 시연 수보다 시연의 다양성과 일관성에 좌우된다는 보고[16]와 같이, 시연 수를 늘리는 것만으로는 시연 설계의 효과를 대신하기 어렵다.</w:t>
+        <w:t xml:space="preserve">표 3은 단계별 성공률(각 50회)과 세 단계를 이어 수행한 연속 성공률(50회)이다. 초기 시연(여유 1.5mm, 100회)의 단계별 성공률은 1층 76%, 옆 84%, 2층 50%였으나, 앞 단계의 배치 오차가 다음 단계로 넘어가 연속 성공률은 28%에 그쳤다. 실패의 대부분은 고정 집게가 통 벽 위에 걸려 끝까지 내려가지 못한 채 닫힌 경우였다. 파지 여유를 9mm로 둔 시연으로 같은 100회를 학습하면 단계별 90%, 88%, 72%, 연속 62%로 높아졌다. 남은 실패 25건 중 24건은 저울 위 통이 +7.5° 넘게 돌아간 시행에서 일어났다(그림 3). 이 구간의 실패율은 49%, 나머지는 1%로, 전문가가 잡는 벽을 바꾸는 구간과 일치한다. 이때 정책은 앞벽과 옆벽 시연의 중간인 모서리 쪽으로 가서 집게를 벽 위에 얹은 채 닫았다. 같은 설계로 시연을 200회로 늘리면 연속 성공률은 오히려 36%로 낮아졌고, 이 구간의 실패가 24건에서 32건으로 늘었다. 늘 같은 벽을 잡는 시연(③)으로 바꾸자 같은 100회에서 집기 실패가 없어져 단계별 100%, 100%, 86%, 연속 82%가 되었다. 남은 2층 실패는 모두 통 C를 평평하게 놓은 뒤 그리퍼가 곧장 올라가며 고정 집게로 벽을 끌어 올려 10° 넘게 기운 경우였고, 2mm 벽 위에 얹힌 통이라 바닥에서와 달리 다시 내려앉지 못했다. 그리퍼를 벌린 뒤 벽 바깥으로 5mm 물러났다가 올라가는 시연(④, 2층만)으로 바꾸자 전문가의 3° 이상 기울어짐이 50회 중 11회에서 1회로 줄었고, 정책은 단계별 100%, 100%, 100%, 연속 96%였다. 같은 정책을 장면 200개로 늘려 평가하면(CPU 추론) 단계별 100.0%, 100.0%, 99.5%, 연속 99.0%(95% CI 96.4–99.7%)로, 팀의 원래 조건인 단계별 시연 100회만으로 연속 성공률 95% 이상을 신뢰구간 하한까지 확인하였다. 남은 실패 2건은 옆 단계에서 통을 집지 못해 통이 저울에 그대로 남은 경우였으므로, 저울을 다시 읽어 같은 단계를 재실행하게 하자 연속 100%(200/200, 95% CI 98.1–100%)가 되었다.</w:t>
       </w:r>
     </w:p>
     <w:p xmlns:a="http://schemas.openxmlformats.org/drawingml/2006/main" xmlns:pic="http://schemas.openxmlformats.org/drawingml/2006/picture">
@@ -3620,7 +3603,7 @@
         </w:rPr>
         <w:drawing>
           <wp:inline distT="0" distB="0" distL="0" distR="0">
-            <wp:extent cx="2793333" cy="1396666"/>
+            <wp:extent cx="2793333" cy="1761948"/>
             <wp:docPr id="104" name="Figure 4"/>
             <a:graphic>
               <a:graphicData uri="http://schemas.openxmlformats.org/drawingml/2006/picture">
@@ -3631,6 +3614,84 @@
                   </pic:nvPicPr>
                   <pic:blipFill>
                     <a:blip r:embed="rIdFig4"/>
+                    <a:stretch>
+                      <a:fillRect/>
+                    </a:stretch>
+                  </pic:blipFill>
+                  <pic:spPr>
+                    <a:xfrm>
+                      <a:off x="0" y="0"/>
+                      <a:ext cx="2793333" cy="1761948"/>
+                    </a:xfrm>
+                    <a:prstGeom prst="rect">
+                      <a:avLst/>
+                    </a:prstGeom>
+                  </pic:spPr>
+                </pic:pic>
+              </a:graphicData>
+            </a:graphic>
+          </wp:inline>
+        </w:drawing>
+      </w:r>
+    </w:p>
+    <w:p>
+      <w:pPr>
+        <w:pStyle w:val="a3"/>
+        <w:wordWrap/>
+        <w:spacing w:before="0" w:after="80" w:line="264" w:lineRule="auto"/>
+        <w:jc w:val="center"/>
+      </w:pPr>
+      <w:r>
+        <w:rPr>
+          <w:rFonts w:ascii="HY신명조" w:eastAsia="HY신명조" w:hAnsi="HY신명조" w:hint="eastAsia"/>
+          <w:sz w:val="17"/>
+          <w:szCs w:val="17"/>
+        </w:rPr>
+        <w:t xml:space="preserve">그림 4. 시연 수에 따른 적재 성공률 (④ 시연)</w:t>
+      </w:r>
+    </w:p>
+    <w:p>
+      <w:pPr>
+        <w:pStyle w:val="a3"/>
+        <w:wordWrap/>
+        <w:spacing w:before="0" w:after="0" w:line="288" w:lineRule="auto"/>
+        <w:ind w:firstLine="180"/>
+        <w:jc w:val="both"/>
+      </w:pPr>
+      <w:r>
+        <w:rPr>
+          <w:rFonts w:ascii="HY신명조" w:eastAsia="HY신명조" w:hAnsi="HY신명조" w:hint="eastAsia"/>
+          <w:sz w:val="18"/>
+          <w:szCs w:val="18"/>
+        </w:rPr>
+        <w:t xml:space="preserve">④ 시연을 200, 500, 1000회로 늘리면 연속 성공률은 92%, [  ]%, [  ]%였다(그림 4). 시연 잡음을 주입한 DART 정책은 같은 1000회에서 연속 [  ]%였다. 저울을 다시 읽어 통이 그대로 있으면 집기 실패로 보고 같은 단계를 다시 실행하게 하면(최대 3회), ② 시연 100회 정책의 연속 성공률은 58%에서 74%로, ④ 시연 1000회 정책은 [  ]%에서 [  ]%로 높아졌다. 적재 1회는 정책 실행 9초와 홈 복귀 1초로 약 10초가 걸린다. 행동 청크(100스텝, 3.3초)마다 한 번만 추론하므로 스텝당 평균 추론 시간은 GTX 1080 Ti에서 2.7ms, CPU 2스레드에서 4.4ms로 (다른 학습과 장치를 함께 쓴 상태의 값으로 상한에 해당) 제어 주기(33ms)보다 충분히 짧았다. 무게 분류 정분류율(91.7%)을 곱한 공정 전체 성공률은 ④ 시연 1000회 기준 약 [  ]%이다. 모방학습 성능이 시연 수보다 시연의 다양성과 일관성에 좌우된다는 보고[16]와 같이, 시연 수를 늘리는 것만으로는 시연 설계의 효과를 대신하기 어렵다.</w:t>
+      </w:r>
+    </w:p>
+    <w:p xmlns:a="http://schemas.openxmlformats.org/drawingml/2006/main" xmlns:pic="http://schemas.openxmlformats.org/drawingml/2006/picture">
+      <w:pPr>
+        <w:pStyle w:val="a3"/>
+        <w:keepNext/>
+        <w:wordWrap/>
+        <w:spacing w:before="80" w:after="0" w:line="240" w:lineRule="auto"/>
+        <w:jc w:val="center"/>
+      </w:pPr>
+      <w:r>
+        <w:rPr>
+          <w:noProof/>
+        </w:rPr>
+        <w:drawing>
+          <wp:inline distT="0" distB="0" distL="0" distR="0">
+            <wp:extent cx="2793333" cy="1396666"/>
+            <wp:docPr id="105" name="Figure 5"/>
+            <a:graphic>
+              <a:graphicData uri="http://schemas.openxmlformats.org/drawingml/2006/picture">
+                <pic:pic>
+                  <pic:nvPicPr>
+                    <pic:cNvPr id="105" name="fig5.png"/>
+                    <pic:cNvPicPr/>
+                  </pic:nvPicPr>
+                  <pic:blipFill>
+                    <a:blip r:embed="rIdFig5"/>
                     <a:stretch>
                       <a:fillRect/>
                     </a:stretch>
@@ -3664,7 +3725,7 @@
           <w:sz w:val="17"/>
           <w:szCs w:val="17"/>
         </w:rPr>
-        <w:t xml:space="preserve">그림 4. ACT 정책의 연속 적재 장면</w:t>
+        <w:t xml:space="preserve">그림 5. ACT 정책의 연속 적재 장면</w:t>
       </w:r>
     </w:p>
     <w:p>
@@ -4163,6 +4224,53 @@
                 <w:szCs w:val="15"/>
               </w:rPr>
               <w:t xml:space="preserve">95</w:t>
+            </w:r>
+          </w:p>
+        </w:tc>
+      </w:tr>
+      <w:tr>
+        <w:trPr>
+          <w:cantSplit/>
+        </w:trPr>
+        <w:tc>
+          <w:tcPr>
+            <w:tcW w:w="1900" w:type="dxa"/>
+            <w:vAlign w:val="center"/>
+          </w:tcPr>
+          <w:p>
+            <w:pPr>
+              <w:pStyle w:val="a3"/>
+              <w:spacing w:before="10" w:after="10" w:line="240" w:lineRule="auto"/>
+              <w:jc w:val="center"/>
+            </w:pPr>
+            <w:r>
+              <w:rPr>
+                <w:rFonts w:ascii="HY신명조" w:eastAsia="HY신명조" w:hAnsi="HY신명조" w:hint="eastAsia"/>
+                <w:sz w:val="15"/>
+                <w:szCs w:val="15"/>
+              </w:rPr>
+              <w:t xml:space="preserve">무작위화 범위 밖 (조명 30·220%, 주황빛, 체크무늬)</w:t>
+            </w:r>
+          </w:p>
+        </w:tc>
+        <w:tc>
+          <w:tcPr>
+            <w:tcW w:w="2600" w:type="dxa"/>
+            <w:vAlign w:val="center"/>
+          </w:tcPr>
+          <w:p>
+            <w:pPr>
+              <w:pStyle w:val="a3"/>
+              <w:spacing w:before="10" w:after="10" w:line="240" w:lineRule="auto"/>
+              <w:jc w:val="center"/>
+            </w:pPr>
+            <w:r>
+              <w:rPr>
+                <w:rFonts w:ascii="HY신명조" w:eastAsia="HY신명조" w:hAnsi="HY신명조" w:hint="eastAsia"/>
+                <w:sz w:val="15"/>
+                <w:szCs w:val="15"/>
+              </w:rPr>
+              <w:t xml:space="preserve">[  ]</w:t>
             </w:r>
           </w:p>
         </w:tc>

</xml_diff>